<commit_message>
Added dense and moderate dummy data generation scripts
</commit_message>
<xml_diff>
--- a/Report.docx
+++ b/Report.docx
@@ -1917,6 +1917,183 @@
       </w:r>
     </w:p>
     <w:p>
+      <w:r>
+        <w:rPr>
+          <w:b/>
+        </w:rPr>
+        <w:t xml:space="preserve">VI. GRADIENT COMPRESSION PERFORMANCE ANALYSIS</w:t>
+      </w:r>
+    </w:p>
+    <w:p/>
+    <w:p>
+      <w:r>
+        <w:rPr>
+          <w:b/>
+        </w:rPr>
+        <w:t xml:space="preserve">A. Motivation and Scenario Definition</w:t>
+      </w:r>
+    </w:p>
+    <w:p>
+      <w:r>
+        <w:t xml:space="preserve">The 256-symbol Huffman hardware is designed to compress bfloat16 gradient tensors before gRPC transmission in a distributed LLM training system. Three frequency distributions were defined that model different stages of training, and a canonical Huffman codebook was computed for each.</w:t>
+      </w:r>
+    </w:p>
+    <w:p>
+      <w:r>
+        <w:t xml:space="preserve">The highly sparse scenario (FREQS[0x00] = 10000) models early-training gradients where zero bytes dominate. The moderate scenario (FREQS[0x00] = 1000) models mid-training gradients where zeros remain common but non-zero values are significant. The dense scenario (FREQS[0x00] = 100) models late-training gradients where the byte distribution is nearly uniform.</w:t>
+      </w:r>
+    </w:p>
+    <w:p/>
+    <w:p>
+      <w:r>
+        <w:rPr>
+          <w:b/>
+        </w:rPr>
+        <w:t xml:space="preserve">B. Compression Results</w:t>
+      </w:r>
+    </w:p>
+    <w:p>
+      <w:r>
+        <w:t xml:space="preserve">Table I summarises the canonical Huffman results for each scenario. The average code length is the weighted mean over all 256 symbols; the compression ratio is defined as 8 / average_code_length.</w:t>
+      </w:r>
+    </w:p>
+    <w:p/>
+    <w:p>
+      <w:r>
+        <w:rPr>
+          <w:b/>
+        </w:rPr>
+        <w:t xml:space="preserve">TABLE I — HUFFMAN COMPRESSION ACROSS GRADIENT SCENARIOS</w:t>
+      </w:r>
+    </w:p>
+    <w:p>
+      <w:r>
+        <w:rPr>
+          <w:i/>
+        </w:rPr>
+        <w:t xml:space="preserve">Scenario  |  FREQS[0x00]  |  Avg Code Length (bits)  |  Compression Ratio</w:t>
+      </w:r>
+    </w:p>
+    <w:p>
+      <w:r>
+        <w:rPr>
+          <w:i/>
+        </w:rPr>
+        <w:t xml:space="preserve">Highly Sparse  |  10,000  |  3.314  |  2.41x</w:t>
+      </w:r>
+    </w:p>
+    <w:p>
+      <w:r>
+        <w:rPr>
+          <w:i/>
+        </w:rPr>
+        <w:t xml:space="preserve">Moderate  |  1,000  |  5.908  |  1.35x</w:t>
+      </w:r>
+    </w:p>
+    <w:p>
+      <w:r>
+        <w:rPr>
+          <w:i/>
+        </w:rPr>
+        <w:t xml:space="preserve">Dense  |  100  |  7.862  |  1.02x</w:t>
+      </w:r>
+    </w:p>
+    <w:p/>
+    <w:p>
+      <w:r>
+        <w:t xml:space="preserve">The highly sparse distribution achieves 2.41x compression, driven by the dominant zero byte being assigned a single-bit code. The moderate distribution achieves 1.35x. The dense distribution achieves only 1.02x, confirming that Huffman coding provides negligible benefit when all symbols are approximately equally likely.</w:t>
+      </w:r>
+    </w:p>
+    <w:p/>
+    <w:p>
+      <w:r>
+        <w:rPr>
+          <w:b/>
+        </w:rPr>
+        <w:t xml:space="preserve">C. Impact on Gradient Communication</w:t>
+      </w:r>
+    </w:p>
+    <w:p>
+      <w:r>
+        <w:t xml:space="preserve">For a GPT-2 model (124 million parameters, bfloat16 precision), each gradient synchronisation round transmits approximately 248 MB of raw data. Table II shows the compressed payload and estimated transfer time for each scenario on a 1 Gbps gRPC link (baseline transfer time: 1984 ms).</w:t>
+      </w:r>
+    </w:p>
+    <w:p/>
+    <w:p>
+      <w:r>
+        <w:rPr>
+          <w:b/>
+        </w:rPr>
+        <w:t xml:space="preserve">TABLE II — GRADIENT TRANSFER IMPACT (GPT-2, 248 MB, 1 Gbps LINK)</w:t>
+      </w:r>
+    </w:p>
+    <w:p>
+      <w:r>
+        <w:rPr>
+          <w:i/>
+        </w:rPr>
+        <w:t xml:space="preserve">Scenario  |  Compressed Size  |  Transfer Time  |  Time Saved  |  Reduction</w:t>
+      </w:r>
+    </w:p>
+    <w:p>
+      <w:r>
+        <w:rPr>
+          <w:i/>
+        </w:rPr>
+        <w:t xml:space="preserve">Highly Sparse (2.41x)  |  103 MB  |  823 ms  |  1161 ms  |  58.5%</w:t>
+      </w:r>
+    </w:p>
+    <w:p>
+      <w:r>
+        <w:rPr>
+          <w:i/>
+        </w:rPr>
+        <w:t xml:space="preserve">Moderate (1.35x)  |  184 MB  |  1470 ms  |  514 ms  |  25.9%</w:t>
+      </w:r>
+    </w:p>
+    <w:p>
+      <w:r>
+        <w:rPr>
+          <w:i/>
+        </w:rPr>
+        <w:t xml:space="preserve">Dense (1.02x)  |  243 MB  |  1945 ms  |  39 ms  |  2.0%</w:t>
+      </w:r>
+    </w:p>
+    <w:p>
+      <w:r>
+        <w:rPr>
+          <w:i/>
+        </w:rPr>
+        <w:t xml:space="preserve">No compression  |  248 MB  |  1984 ms  |  —  |  —</w:t>
+      </w:r>
+    </w:p>
+    <w:p/>
+    <w:p>
+      <w:r>
+        <w:t xml:space="preserve">Under sparse gradient conditions — the dominant case during early training — FPGA Huffman compression reduces the 248 MB payload to approximately 103 MB, cutting transfer time by 58.5% per synchronisation round. This directly accelerates the global step rate in the parameter-server training loop. For moderate gradients the saving is 25.9%, still meaningful when communication is the bottleneck. For dense gradients the saving is negligible (2.0%), and bypassing compression would be preferable to avoid encoding latency.</w:t>
+      </w:r>
+    </w:p>
+    <w:p/>
+    <w:p>
+      <w:r>
+        <w:rPr>
+          <w:b/>
+        </w:rPr>
+        <w:t xml:space="preserve">D. Hardware Verification Across Scenarios</w:t>
+      </w:r>
+    </w:p>
+    <w:p>
+      <w:r>
+        <w:t xml:space="preserve">Each scenario was verified end-to-end in Vivado behavioural simulation. The Python scripts (compute_huffman_highly_sparse.py, compute_huffman_moderate.py, compute_huffman_dense.py) regenerate huffman_tables.svh for each distribution; the testbench includes this file and calls config_encoder_full() and config_decoder_full() at runtime — no RTL modifications are required between scenarios.</w:t>
+      </w:r>
+    </w:p>
+    <w:p>
+      <w:r>
+        <w:t xml:space="preserve">In all three cases, symbol_out correctly reproduced the input sequence after the full encoder-decoder pipeline. The waveforms show the expected increase in stream_valid pulse frequency as average code length grows: in the dense case, fewer symbols fit per 32-bit stream word, producing more frequent handshakes for the same input volume.</w:t>
+      </w:r>
+    </w:p>
+    <w:p/>
+    <w:p>
       <w:pPr>
         <w:spacing w:before="280" w:after="140"/>
         <w:jc w:val="center"/>
@@ -1926,7 +2103,7 @@
           <w:b/>
           <w:bCs/>
         </w:rPr>
-        <w:t>VI. DISCUSSION</w:t>
+        <w:t>VII. DISCUSSION</w:t>
       </w:r>
     </w:p>
     <w:p>
@@ -2135,7 +2312,7 @@
           <w:b/>
           <w:bCs/>
         </w:rPr>
-        <w:t>VII. CONCLUSION</w:t>
+        <w:t>VIII. CONCLUSION</w:t>
       </w:r>
     </w:p>
     <w:p>

</xml_diff>